<commit_message>
content: update video submission requirements
</commit_message>
<xml_diff>
--- a/client/public/documents/art-hit-polozhenie.docx
+++ b/client/public/documents/art-hit-polozhenie.docx
@@ -362,164 +362,290 @@
           <w:sz w:val="28"/>
           <w:szCs w:val="28"/>
         </w:rPr>
-        <w:t>1. На конкурс допускаются видеозаписи живого выступления, снятые на сцене на статичную камеру (без элементов монтажа, склейки кадров, наложения аудиодорожек).</w:t>
-      </w:r>
-      <w:r>
-        <w:rPr>
-          <w:color w:val="1E365A"/>
-          <w:sz w:val="28"/>
-          <w:szCs w:val="28"/>
-        </w:rPr>
-        <w:br/>
-      </w:r>
-      <w:r>
-        <w:rPr>
-          <w:rStyle w:val="rte-text"/>
-          <w:color w:val="1E365A"/>
-          <w:sz w:val="28"/>
-          <w:szCs w:val="28"/>
-        </w:rPr>
-        <w:lastRenderedPageBreak/>
-        <w:t>2. На видео должен быть записан один отдельный конкурсный номер.</w:t>
-      </w:r>
-      <w:r>
-        <w:rPr>
-          <w:color w:val="1E365A"/>
-          <w:sz w:val="28"/>
-          <w:szCs w:val="28"/>
-        </w:rPr>
-        <w:br/>
-      </w:r>
-      <w:r>
-        <w:rPr>
-          <w:rStyle w:val="rte-text"/>
-          <w:color w:val="1E365A"/>
-          <w:sz w:val="28"/>
-          <w:szCs w:val="28"/>
-        </w:rPr>
-        <w:t>3. Остановка в работе видеокамеры во время записи выступления не допускается.</w:t>
-      </w:r>
-      <w:r>
-        <w:rPr>
-          <w:color w:val="1E365A"/>
-          <w:sz w:val="28"/>
-          <w:szCs w:val="28"/>
-        </w:rPr>
-        <w:br/>
-      </w:r>
-      <w:r>
-        <w:rPr>
-          <w:rStyle w:val="rte-text"/>
-          <w:color w:val="1E365A"/>
-          <w:sz w:val="28"/>
-          <w:szCs w:val="28"/>
-        </w:rPr>
-        <w:t>4. Съёмка должна быть не старше 2 лет.</w:t>
-      </w:r>
-      <w:r>
-        <w:rPr>
-          <w:color w:val="1E365A"/>
-          <w:sz w:val="28"/>
-          <w:szCs w:val="28"/>
-        </w:rPr>
-        <w:br/>
-      </w:r>
-      <w:r>
-        <w:rPr>
-          <w:rStyle w:val="rte-text"/>
-          <w:color w:val="1E365A"/>
-          <w:sz w:val="28"/>
-          <w:szCs w:val="28"/>
-        </w:rPr>
-        <w:t>5. Видеозаписи низкого качества, в т.ч. записи разрешением менее 720 пикселей, к участию не допускаются.</w:t>
-      </w:r>
-      <w:r>
-        <w:rPr>
-          <w:color w:val="1E365A"/>
-          <w:sz w:val="28"/>
-          <w:szCs w:val="28"/>
-        </w:rPr>
-        <w:br/>
-      </w:r>
-      <w:r>
-        <w:rPr>
-          <w:rStyle w:val="rte-text"/>
-          <w:color w:val="1E365A"/>
-          <w:sz w:val="28"/>
-          <w:szCs w:val="28"/>
-        </w:rPr>
-        <w:t>6. На видеозаписях участников номинации должны быть видны руки, ноги и лица конкурсантов.</w:t>
-      </w:r>
-    </w:p>
-    <w:p ns2:paraId="39CABD06" ns2:textId="77777777">
-      <w:pPr>
-        <w:pStyle w:val="a4"/>
-        <w:spacing w:before="0" w:beforeAutospacing="0" w:after="0" w:afterAutospacing="0"/>
-        <w:rPr>
-          <w:color w:val="1E365A"/>
-          <w:sz w:val="28"/>
-          <w:szCs w:val="28"/>
-        </w:rPr>
-      </w:pPr>
-      <w:r>
-        <w:rPr>
-          <w:rStyle w:val="rte-text"/>
-          <w:color w:val="1E365A"/>
-          <w:sz w:val="28"/>
-          <w:szCs w:val="28"/>
-        </w:rPr>
-        <w:t>Конкурсное выступление должно быть опубликова</w:t>
-      </w:r>
-      <w:r>
-        <w:rPr>
-          <w:rStyle w:val="rte-text"/>
-          <w:color w:val="1E365A"/>
-          <w:sz w:val="28"/>
-          <w:szCs w:val="28"/>
-        </w:rPr>
-        <w:t xml:space="preserve">но участником конкурса на Яндекс. Диск и </w:t>
-      </w:r>
-      <w:r>
-        <w:rPr>
-          <w:rStyle w:val="rte-text"/>
-          <w:color w:val="1E365A"/>
-          <w:sz w:val="28"/>
-          <w:szCs w:val="28"/>
-        </w:rPr>
-        <w:t>иметь открытый доступ.</w:t>
-      </w:r>
-    </w:p>
-    <w:p ns2:paraId="31C250E5" ns2:textId="77777777">
-      <w:pPr>
-        <w:pStyle w:val="a4"/>
-        <w:spacing w:before="0" w:beforeAutospacing="0" w:after="0" w:afterAutospacing="0"/>
-        <w:rPr>
-          <w:color w:val="1E365A"/>
-          <w:sz w:val="28"/>
-          <w:szCs w:val="28"/>
-        </w:rPr>
-      </w:pPr>
-      <w:r>
-        <w:rPr>
-          <w:rStyle w:val="rte-text"/>
-          <w:color w:val="1E365A"/>
-          <w:sz w:val="28"/>
-          <w:szCs w:val="28"/>
-        </w:rPr>
-        <w:t>Отправляя ссылку на видеозапись/фото, участник конкурса автоматически подтверждает свое согласие на использование материала третьими лицами (организаторами, членами жюри, другими участниками конкурса), а также для размещения конкурсной работы на сайте организатора.</w:t>
-      </w:r>
-    </w:p>
-    <w:p ns2:paraId="06A62E85" ns2:textId="77777777">
-      <w:pPr>
-        <w:pStyle w:val="3"/>
-        <w:shd w:val="clear" w:color="auto" w:fill="FFFFFF"/>
-        <w:spacing w:before="0"/>
-        <w:rPr>
-          <w:rFonts w:ascii="Times New Roman" w:hAnsi="Times New Roman" w:cs="Times New Roman"/>
-          <w:sz w:val="28"/>
-          <w:szCs w:val="28"/>
-        </w:rPr>
-      </w:pPr>
+        <w:t xml:space="preserve">1. На конкурс допускаются видеозаписи живого выступления, снятые на сцене на статичную камеру (без элементов монтажа, склейки кадров, наложения аудиодорожек).</w:t>
+      </w:r>
+    </w:p>
+    <w:p ns2:paraId="00438826" ns2:textId="77777777">
+      <w:pPr>
+        <w:pStyle w:val="a4"/>
+        <w:spacing w:before="0" w:beforeAutospacing="0" w:after="0" w:afterAutospacing="0"/>
+        <w:rPr>
+          <w:color w:val="1E365A"/>
+          <w:sz w:val="28"/>
+          <w:szCs w:val="28"/>
+        </w:rPr>
+      </w:pPr>
+      <w:r>
+        <w:rPr>
+          <w:rStyle w:val="rte-text"/>
+          <w:color w:val="1E365A"/>
+          <w:sz w:val="28"/>
+          <w:szCs w:val="28"/>
+        </w:rPr>
+        <w:t xml:space="preserve">2. На видео должен быть записан один отдельный конкурсный номер.</w:t>
+      </w:r>
+    </w:p>
+    <w:p ns2:paraId="00438826" ns2:textId="77777777">
+      <w:pPr>
+        <w:pStyle w:val="a4"/>
+        <w:spacing w:before="0" w:beforeAutospacing="0" w:after="0" w:afterAutospacing="0"/>
+        <w:rPr>
+          <w:color w:val="1E365A"/>
+          <w:sz w:val="28"/>
+          <w:szCs w:val="28"/>
+        </w:rPr>
+      </w:pPr>
+      <w:r>
+        <w:rPr>
+          <w:rStyle w:val="rte-text"/>
+          <w:color w:val="1E365A"/>
+          <w:sz w:val="28"/>
+          <w:szCs w:val="28"/>
+        </w:rPr>
+        <w:t xml:space="preserve">3. Остановка в работе видеокамеры во время записи выступления не допускается.</w:t>
+      </w:r>
+    </w:p>
+    <w:p ns2:paraId="00438826" ns2:textId="77777777">
+      <w:pPr>
+        <w:pStyle w:val="a4"/>
+        <w:spacing w:before="0" w:beforeAutospacing="0" w:after="0" w:afterAutospacing="0"/>
+        <w:rPr>
+          <w:color w:val="1E365A"/>
+          <w:sz w:val="28"/>
+          <w:szCs w:val="28"/>
+        </w:rPr>
+      </w:pPr>
+      <w:r>
+        <w:rPr>
+          <w:rStyle w:val="rte-text"/>
+          <w:color w:val="1E365A"/>
+          <w:sz w:val="28"/>
+          <w:szCs w:val="28"/>
+        </w:rPr>
+        <w:t xml:space="preserve">4. Съёмка должна быть не старше 2 лет.</w:t>
+      </w:r>
+    </w:p>
+    <w:p ns2:paraId="00438826" ns2:textId="77777777">
+      <w:pPr>
+        <w:pStyle w:val="a4"/>
+        <w:spacing w:before="0" w:beforeAutospacing="0" w:after="0" w:afterAutospacing="0"/>
+        <w:rPr>
+          <w:color w:val="1E365A"/>
+          <w:sz w:val="28"/>
+          <w:szCs w:val="28"/>
+        </w:rPr>
+      </w:pPr>
+      <w:r>
+        <w:rPr>
+          <w:rStyle w:val="rte-text"/>
+          <w:color w:val="1E365A"/>
+          <w:sz w:val="28"/>
+          <w:szCs w:val="28"/>
+        </w:rPr>
+        <w:t xml:space="preserve">5. Видеозаписи низкого качества, в т.ч. записи разрешением менее 720 пикселей, к участию не допускаются.</w:t>
+      </w:r>
+    </w:p>
+    <w:p ns2:paraId="00438826" ns2:textId="77777777">
+      <w:pPr>
+        <w:pStyle w:val="a4"/>
+        <w:spacing w:before="0" w:beforeAutospacing="0" w:after="0" w:afterAutospacing="0"/>
+        <w:rPr>
+          <w:color w:val="1E365A"/>
+          <w:sz w:val="28"/>
+          <w:szCs w:val="28"/>
+        </w:rPr>
+      </w:pPr>
+      <w:r>
+        <w:rPr>
+          <w:rStyle w:val="rte-text"/>
+          <w:color w:val="1E365A"/>
+          <w:sz w:val="28"/>
+          <w:szCs w:val="28"/>
+        </w:rPr>
+        <w:t xml:space="preserve">6. На видеозаписях участников номинации должны быть видны руки, ноги и лица конкурсантов.</w:t>
+      </w:r>
+    </w:p>
+    <w:p ns2:paraId="00438826" ns2:textId="77777777">
+      <w:pPr>
+        <w:pStyle w:val="a4"/>
+        <w:spacing w:before="0" w:beforeAutospacing="0" w:after="0" w:afterAutospacing="0"/>
+        <w:rPr>
+          <w:color w:val="1E365A"/>
+          <w:sz w:val="28"/>
+          <w:szCs w:val="28"/>
+        </w:rPr>
+      </w:pPr>
+      <w:r>
+        <w:rPr>
+          <w:rStyle w:val="rte-text"/>
+          <w:color w:val="1E365A"/>
+          <w:sz w:val="28"/>
+          <w:szCs w:val="28"/>
+        </w:rPr>
+        <w:t xml:space="preserve">Конкурсное выступление должно быть опубликовано участником конкурса  на сайте  https://rutube.ru/  и в online-хранилище: Яндекс Диск, Google Диск, облако Mail и иметь открытый доступ. Также допускается размещение на ресурсе Vimeo.</w:t>
+      </w:r>
+    </w:p>
+    <w:p ns2:paraId="00438826" ns2:textId="77777777">
+      <w:pPr>
+        <w:pStyle w:val="a4"/>
+        <w:spacing w:before="0" w:beforeAutospacing="0" w:after="0" w:afterAutospacing="0"/>
+        <w:rPr>
+          <w:color w:val="1E365A"/>
+          <w:sz w:val="28"/>
+          <w:szCs w:val="28"/>
+        </w:rPr>
+      </w:pPr>
+    </w:p>
+    <w:p ns2:paraId="00438826" ns2:textId="77777777">
+      <w:pPr>
+        <w:pStyle w:val="a4"/>
+        <w:spacing w:before="0" w:beforeAutospacing="0" w:after="0" w:afterAutospacing="0"/>
+        <w:rPr>
+          <w:color w:val="1E365A"/>
+          <w:sz w:val="28"/>
+          <w:szCs w:val="28"/>
+        </w:rPr>
+      </w:pPr>
+      <w:r>
+        <w:rPr>
+          <w:rStyle w:val="rte-text"/>
+          <w:color w:val="1E365A"/>
+          <w:sz w:val="28"/>
+          <w:szCs w:val="28"/>
+        </w:rPr>
+        <w:t xml:space="preserve">ОБРАЩАЕМ ВАШЕ ВНИМАНИЕ!</w:t>
+      </w:r>
+    </w:p>
+    <w:p ns2:paraId="00438826" ns2:textId="77777777">
+      <w:pPr>
+        <w:pStyle w:val="a4"/>
+        <w:spacing w:before="0" w:beforeAutospacing="0" w:after="0" w:afterAutospacing="0"/>
+        <w:rPr>
+          <w:color w:val="1E365A"/>
+          <w:sz w:val="28"/>
+          <w:szCs w:val="28"/>
+        </w:rPr>
+      </w:pPr>
+      <w:r>
+        <w:rPr>
+          <w:rStyle w:val="rte-text"/>
+          <w:color w:val="1E365A"/>
+          <w:sz w:val="28"/>
+          <w:szCs w:val="28"/>
+        </w:rPr>
+        <w:t xml:space="preserve">Для подачи заявок в жанре «Танцевальное творчество» необходимо предоставить материал, соответствующий следующим требованиям:</w:t>
+      </w:r>
+    </w:p>
+    <w:p ns2:paraId="00438826" ns2:textId="77777777">
+      <w:pPr>
+        <w:pStyle w:val="a4"/>
+        <w:spacing w:before="0" w:beforeAutospacing="0" w:after="0" w:afterAutospacing="0"/>
+        <w:rPr>
+          <w:color w:val="1E365A"/>
+          <w:sz w:val="28"/>
+          <w:szCs w:val="28"/>
+        </w:rPr>
+      </w:pPr>
+      <w:r>
+        <w:rPr>
+          <w:rStyle w:val="rte-text"/>
+          <w:color w:val="1E365A"/>
+          <w:sz w:val="28"/>
+          <w:szCs w:val="28"/>
+        </w:rPr>
+        <w:t xml:space="preserve">- на видео представлено только конкурсное выступление артистов (запись концерта целиком не допускается);</w:t>
+      </w:r>
+    </w:p>
+    <w:p ns2:paraId="00438826" ns2:textId="77777777">
+      <w:pPr>
+        <w:pStyle w:val="a4"/>
+        <w:spacing w:before="0" w:beforeAutospacing="0" w:after="0" w:afterAutospacing="0"/>
+        <w:rPr>
+          <w:color w:val="1E365A"/>
+          <w:sz w:val="28"/>
+          <w:szCs w:val="28"/>
+        </w:rPr>
+      </w:pPr>
+      <w:r>
+        <w:rPr>
+          <w:rStyle w:val="rte-text"/>
+          <w:color w:val="1E365A"/>
+          <w:sz w:val="28"/>
+          <w:szCs w:val="28"/>
+        </w:rPr>
+        <w:t xml:space="preserve">- съемка должна быть произведена в цветном режиме;</w:t>
+      </w:r>
+    </w:p>
+    <w:p ns2:paraId="00438826" ns2:textId="77777777">
+      <w:pPr>
+        <w:pStyle w:val="a4"/>
+        <w:spacing w:before="0" w:beforeAutospacing="0" w:after="0" w:afterAutospacing="0"/>
+        <w:rPr>
+          <w:color w:val="1E365A"/>
+          <w:sz w:val="28"/>
+          <w:szCs w:val="28"/>
+        </w:rPr>
+      </w:pPr>
+      <w:r>
+        <w:rPr>
+          <w:rStyle w:val="rte-text"/>
+          <w:color w:val="1E365A"/>
+          <w:sz w:val="28"/>
+          <w:szCs w:val="28"/>
+        </w:rPr>
+        <w:t xml:space="preserve">- конкурсное выступление должно быть записано на сцене в предусмотренных номером сценических костюмах (выступления на улице, в спортзале/без костюмов существенно снижают образность номера и влияют на оценку выступления);</w:t>
+      </w:r>
+    </w:p>
+    <w:p ns2:paraId="00438826" ns2:textId="77777777">
+      <w:pPr>
+        <w:pStyle w:val="a4"/>
+        <w:spacing w:before="0" w:beforeAutospacing="0" w:after="0" w:afterAutospacing="0"/>
+        <w:rPr>
+          <w:color w:val="1E365A"/>
+          <w:sz w:val="28"/>
+          <w:szCs w:val="28"/>
+        </w:rPr>
+      </w:pPr>
+      <w:r>
+        <w:rPr>
+          <w:rStyle w:val="rte-text"/>
+          <w:color w:val="1E365A"/>
+          <w:sz w:val="28"/>
+          <w:szCs w:val="28"/>
+        </w:rPr>
+        <w:t xml:space="preserve">- описание конкурсного номера в заявке обязательно должно содержать название номера, музыкального сопровождения, ФИО руководителя.</w:t>
+      </w:r>
+    </w:p>
+    <w:p ns2:paraId="00438826" ns2:textId="77777777">
+      <w:pPr>
+        <w:pStyle w:val="a4"/>
+        <w:spacing w:before="0" w:beforeAutospacing="0" w:after="0" w:afterAutospacing="0"/>
+        <w:rPr>
+          <w:color w:val="1E365A"/>
+          <w:sz w:val="28"/>
+          <w:szCs w:val="28"/>
+        </w:rPr>
+      </w:pPr>
+    </w:p>
+    <w:p ns2:paraId="00438826" ns2:textId="77777777">
+      <w:pPr>
+        <w:pStyle w:val="a4"/>
+        <w:spacing w:before="0" w:beforeAutospacing="0" w:after="0" w:afterAutospacing="0"/>
+        <w:rPr>
+          <w:color w:val="1E365A"/>
+          <w:sz w:val="28"/>
+          <w:szCs w:val="28"/>
+        </w:rPr>
+      </w:pPr>
+      <w:r>
+        <w:rPr>
+          <w:rStyle w:val="rte-text"/>
+          <w:color w:val="1E365A"/>
+          <w:sz w:val="28"/>
+          <w:szCs w:val="28"/>
+        </w:rPr>
+        <w:t xml:space="preserve">Отправляя ссылку на видеозапись, участник конкурса автоматически подтверждает свое согласие на использование материала третьими лицами (организаторами, членами жюри, другими участниками конкурса), а также для размещения видеозаписи на сайте организатора. Участник несет ответственность за корректность предоставленных материалов и их описания. Материалы, не отвечающие конкурсным требованиям, могут быть сняты с конкурса организационным комитетом.</w:t>
+      </w:r>
     </w:p>
     <w:p ns2:paraId="3053692D" ns2:textId="77777777">
       <w:pPr>

</xml_diff>